<commit_message>
docs: close visual commerce p0 release record
</commit_message>
<xml_diff>
--- a/deliverables/Mini Games Platform 产品与技术白皮书 v3.0 完善版.docx
+++ b/deliverables/Mini Games Platform 产品与技术白皮书 v3.0 完善版.docx
@@ -42,7 +42,7 @@
           <w:color w:val="3F5668"/>
           <w:sz w:val="34"/>
         </w:rPr>
-        <w:t>v3.0 完善版</w:t>
+        <w:t>v3.3 视觉商城 P0 收口与 Sticker Cartoon M0 冻结版</w:t>
       </w:r>
     </w:p>
     <w:p>
@@ -55,7 +55,7 @@
           <w:color w:val="505A62"/>
           <w:sz w:val="23"/>
         </w:rPr>
-        <w:t>v3.0 当前实现基线 + 生产边界、Gameplay Authority 与 AI 持续学习增补</w:t>
+        <w:t>v3.3 当前六款/双模式事实基线 + 视觉商城素材 P0 + Sticker Cartoon M0</w:t>
       </w:r>
     </w:p>
     <w:p/>
@@ -69,7 +69,7 @@
           <w:color w:val="5A5A5A"/>
           <w:sz w:val="21"/>
         </w:rPr>
-        <w:t>版本日期：2026-08-07</w:t>
+        <w:t>版本日期：2026-08-08</w:t>
       </w:r>
     </w:p>
     <w:p>
@@ -463,7 +463,7 @@
           <w:rFonts w:ascii="Noto Sans CJK SC" w:hAnsi="Noto Sans CJK SC" w:eastAsia="Noto Sans CJK SC"/>
           <w:sz w:val="19"/>
         </w:rPr>
-        <w:t>26. 美术、音频与 Game Feel 的“体验资产化”（v3.0 新增建议）</w:t>
+        <w:t>26. 美术、音频与 Game Feel 体验资产化</w:t>
       </w:r>
     </w:p>
     <w:p>
@@ -597,7 +597,7 @@
           <w:rFonts w:ascii="Noto Sans CJK SC" w:hAnsi="Noto Sans CJK SC" w:eastAsia="Noto Sans CJK SC"/>
           <w:sz w:val="21"/>
         </w:rPr>
-        <w:t>Mini Games Platform 已从“五款游戏 Demo”演进为具有账号、成长、商城、正式社交图谱和联机房间的网页多人游戏平台。当前产品包含 6 款精选插件化游戏，正式入口只保留人机对战和联机对战；旧同设备多人入口、档案槽位、奖励分支与三语文案已彻底删除。核心体验仍是 Fast Fun Loop：打开约 3 秒进入选择，约 5 分钟完成一局，并能立即再来。</w:t>
+        <w:t>Mini Games Platform 已从“五款游戏 Demo”演进为具有账号、成长、商城、正式社交图谱和联机房间的网页多人游戏平台。当前产品包含 6 款精选插件化游戏，正式入口只保留人机对战和联机对战；旧同设备多人入口、档案槽位、奖励分支及其对应三语文案已删除。Fast Fun Loop 的约 3 秒选择和约 5 分钟一局仍是体验目标，需以线上冷启动、真实设备和真实网络数据持续校准。</w:t>
       </w:r>
     </w:p>
     <w:p>
@@ -760,7 +760,7 @@
           <w:rFonts w:ascii="Noto Sans CJK SC" w:hAnsi="Noto Sans CJK SC" w:eastAsia="Noto Sans CJK SC"/>
           <w:sz w:val="21"/>
         </w:rPr>
-        <w:t>截至本版，6 款精选游戏人机/联机双模式、Seat v2、AI Seat/Controller、READY、观战、公开/私密房、房主转移、Social Graph、Profile v2、游戏外观商城、Daily Task、Replay v1.1、Tournament v1.1、Metrics v2、Reward Resolver、三语与 CI/QA 已具备。真实 Supabase、真实设备/网络整形、跨实例长期 Metrics、外部 Sentry 和完整正式美术仍保持 BLOCKED/待办。</w:t>
+        <w:t>截至本版，6 款精选游戏人机/联机双模式、Seat/Social/Profile v2、游戏外观商城、Daily Task、Replay v1.1、Tournament v1.1、Metrics v2、Reward Resolver、三语与 CI/QA 已具备；六款大厅封面、注册/商城重排、价格契约、五档响应式与本地素材库也已完成自动化及本地浏览器验证。真实 Supabase、真实设备/网络整形、跨实例长期 Metrics、外部 Sentry、远端素材存储和最终 Sticker Cartoon 全量美术仍保持 BLOCKED/待办。</w:t>
       </w:r>
     </w:p>
     <w:p>
@@ -10459,7 +10459,7 @@
                 <w:rFonts w:ascii="Noto Sans CJK SC" w:hAnsi="Noto Sans CJK SC" w:eastAsia="Noto Sans CJK SC"/>
                 <w:sz w:val="16"/>
               </w:rPr>
-              <w:t>P3 商业发行</w:t>
+              <w:t>P3 正式发行</w:t>
             </w:r>
           </w:p>
         </w:tc>
@@ -20473,7 +20473,7 @@
         <w:pStyle w:val="Heading1"/>
       </w:pPr>
       <w:r>
-        <w:t>26. 美术、音频与 Game Feel 的“体验资产化”（v3.0 新增建议）</w:t>
+        <w:t>26. 美术、音频与 Game Feel 体验资产化</w:t>
       </w:r>
     </w:p>
     <w:p>
@@ -27736,11 +27736,6 @@
       </w:r>
     </w:p>
     <w:p>
-      <w:r>
-        <w:br w:type="page"/>
-      </w:r>
-    </w:p>
-    <w:p>
       <w:pPr>
         <w:pStyle w:val="Heading1"/>
       </w:pPr>
@@ -27799,6 +27794,75 @@
       </w:pPr>
       <w:r>
         <w:t>仍未完成：真实 Supabase/RLS/并发/备份回滚、真实移动设备/第二桌面浏览器、真实网络整形、30 分钟 Synthetic Session、跨实例长期 Metrics、外部 Sentry、完整正式美术与跨端发行。Release Candidate 因这些真实环境闸门继续保持 BLOCKED。</w:t>
+      </w:r>
+    </w:p>
+    <w:p>
+      <w:pPr>
+        <w:pStyle w:val="Heading1"/>
+      </w:pPr>
+      <w:r>
+        <w:t>31. 2026-08-08 视觉商城素材 P0 收口与 Sticker Cartoon M0</w:t>
+      </w:r>
+    </w:p>
+    <w:p>
+      <w:r>
+        <w:t>本节以验证提交 52c1a85eedda2651da16b75a8d35a1f8afe3843f、完整 npm test、五档本地浏览器证据和新《全项目美术风格统一与深度重制执行报告》为准。</w:t>
+      </w:r>
+    </w:p>
+    <w:p>
+      <w:pPr>
+        <w:pStyle w:val="ListBullet"/>
+      </w:pPr>
+      <w:r>
+        <w:t>六款大厅均接入 640×360 / 320×180 WebP、lazy/srcset、完整性哈希、许可与 Emoji fallback；当前六图是可回滚软 3D 过渡批次，不冒充最终 Sticker Cartoon 风格或完整游戏包。</w:t>
+      </w:r>
+    </w:p>
+    <w:p>
+      <w:pPr>
+        <w:pStyle w:val="ListBullet"/>
+      </w:pPr>
+      <w:r>
+        <w:t>注册与商城完成产品级重排：48 款 Avatar v2（12 免费、36 商城）、单一滚动容器、主预览/试穿、单例弹层、服务端现有价格一致、Starter Background 假购买入口移除和滚动锁回收。</w:t>
+      </w:r>
+    </w:p>
+    <w:p>
+      <w:pPr>
+        <w:pStyle w:val="ListBullet"/>
+      </w:pPr>
+      <w:r>
+        <w:t>中文、英文、乌克兰语目录统一为 1046 个 key；商品名、游戏顶栏与 Avatar 辅助文本通过连续切换及英文/乌克兰语真实页面泄漏检查。</w:t>
+      </w:r>
+    </w:p>
+    <w:p>
+      <w:pPr>
+        <w:pStyle w:val="ListBullet"/>
+      </w:pPr>
+      <w:r>
+        <w:t>asset-library 作为 provenance sidecar 记录来源、许可、目录/许可证独立哈希、Prompt/模型、预览与未来对象键；asset_manifest.json 继续是唯一运行时机器事实源。</w:t>
+      </w:r>
+    </w:p>
+    <w:p>
+      <w:pPr>
+        <w:pStyle w:val="ListBullet"/>
+      </w:pPr>
+      <w:r>
+        <w:t>新目标视觉为 Pocket Tabletop Sticker × Expressive Sticker Cartoon：粗深色轮廓、两级赛璐璐、Q 版强剪影、统一 Facial Kit 与四段式 Motion。只吸收高层视觉语法，不复制商业游戏具体角色、服装、皇冠、构图、表情帧或高潮 Pose。</w:t>
+      </w:r>
+    </w:p>
+    <w:p>
+      <w:pPr>
+        <w:pStyle w:val="ListBullet"/>
+      </w:pPr>
+      <w:r>
+        <w:t>执行闸门为 Art Bible v1 → Design System v3 / Motion System v1 → Source Manifest v2 → Golden Set（1 Persona×8 状态、4 Avatar、核心 UI、五子棋、飞行棋）→ IP Similarity Review → 批量生产。Golden Set 未通过前不翻新全部 48 Avatar 或其余游戏。</w:t>
+      </w:r>
+    </w:p>
+    <w:p>
+      <w:pPr>
+        <w:pStyle w:val="ListBullet"/>
+      </w:pPr>
+      <w:r>
+        <w:t>真实 Android、iPhone、Tablet、第二桌面浏览器、真实 Supabase/RLS/并发/备份回滚、真实网络整形和 30 分钟会话尚未执行，因此 Release Candidate 继续 BLOCKED，不得写 production-ready。</w:t>
       </w:r>
     </w:p>
     <w:sectPr>
@@ -27806,6 +27870,7 @@
       <w:footerReference w:type="default" r:id="rId10"/>
       <w:headerReference w:type="first" r:id="rId12"/>
       <w:footerReference w:type="first" r:id="rId13"/>
+      <w:headerReference w:type="even" r:id="rId14"/>
       <w:pgSz w:w="12240" w:h="15840"/>
       <w:pgMar w:top="1123" w:right="1181" w:bottom="1037" w:left="1181" w:header="518" w:footer="547" w:gutter="0"/>
       <w:cols w:space="720"/>
@@ -27883,13 +27948,23 @@
         <w:color w:val="5A646C"/>
         <w:sz w:val="17"/>
       </w:rPr>
-      <w:t>Mini Games Platform  ·  产品与技术白皮书 v3.0</w:t>
+      <w:t>Mini Games Platform · 产品与技术白皮书 v3.3</w:t>
     </w:r>
   </w:p>
 </w:hdr>
 </file>
 
 <file path=word/header2.xml><?xml version="1.0" encoding="utf-8"?>
+<w:hdr xmlns:m="http://schemas.openxmlformats.org/officeDocument/2006/math" xmlns:mc="http://schemas.openxmlformats.org/markup-compatibility/2006" xmlns:mo="http://schemas.microsoft.com/office/mac/office/2008/main" xmlns:mv="urn:schemas-microsoft-com:mac:vml" xmlns:o="urn:schemas-microsoft-com:office:office" xmlns:r="http://schemas.openxmlformats.org/officeDocument/2006/relationships" xmlns:v="urn:schemas-microsoft-com:vml" xmlns:w10="urn:schemas-microsoft-com:office:word" xmlns:w14="http://schemas.microsoft.com/office/word/2010/wordml" xmlns:w="http://schemas.openxmlformats.org/wordprocessingml/2006/main" xmlns:wne="http://schemas.microsoft.com/office/word/2006/wordml" xmlns:wp14="http://schemas.microsoft.com/office/word/2010/wordprocessingDrawing" xmlns:wp="http://schemas.openxmlformats.org/drawingml/2006/wordprocessingDrawing" xmlns:wpc="http://schemas.microsoft.com/office/word/2010/wordprocessingCanvas" xmlns:wpg="http://schemas.microsoft.com/office/word/2010/wordprocessingGroup" xmlns:wpi="http://schemas.microsoft.com/office/word/2010/wordprocessingInk" xmlns:wps="http://schemas.microsoft.com/office/word/2010/wordprocessingShape" mc:Ignorable="w14 wp14">
+  <w:p>
+    <w:pPr>
+      <w:pStyle w:val="Header"/>
+    </w:pPr>
+  </w:p>
+</w:hdr>
+</file>
+
+<file path=word/header3.xml><?xml version="1.0" encoding="utf-8"?>
 <w:hdr xmlns:m="http://schemas.openxmlformats.org/officeDocument/2006/math" xmlns:mc="http://schemas.openxmlformats.org/markup-compatibility/2006" xmlns:mo="http://schemas.microsoft.com/office/mac/office/2008/main" xmlns:mv="urn:schemas-microsoft-com:mac:vml" xmlns:o="urn:schemas-microsoft-com:office:office" xmlns:r="http://schemas.openxmlformats.org/officeDocument/2006/relationships" xmlns:v="urn:schemas-microsoft-com:vml" xmlns:w10="urn:schemas-microsoft-com:office:word" xmlns:w14="http://schemas.microsoft.com/office/word/2010/wordml" xmlns:w="http://schemas.openxmlformats.org/wordprocessingml/2006/main" xmlns:wne="http://schemas.microsoft.com/office/word/2006/wordml" xmlns:wp14="http://schemas.microsoft.com/office/word/2010/wordprocessingDrawing" xmlns:wp="http://schemas.openxmlformats.org/drawingml/2006/wordprocessingDrawing" xmlns:wpc="http://schemas.microsoft.com/office/word/2010/wordprocessingCanvas" xmlns:wpg="http://schemas.microsoft.com/office/word/2010/wordprocessingGroup" xmlns:wpi="http://schemas.microsoft.com/office/word/2010/wordprocessingInk" xmlns:wps="http://schemas.microsoft.com/office/word/2010/wordprocessingShape" mc:Ignorable="w14 wp14">
   <w:p>
     <w:pPr>

</xml_diff>